<commit_message>
create deterministic random generator (check body)
2 runs for different node id proves that the numbers generated fot the specific node are allways the same between different runs, ignore code, currently broken and needs fixing. commit just proves the random is deterministic
</commit_message>
<xml_diff>
--- a/docs/book/infrastructure-part-1.docx
+++ b/docs/book/infrastructure-part-1.docx
@@ -685,19 +685,203 @@
         </w:rPr>
       </w:pPr>
       <w:r>
+        <w:rPr>
+          <w:rFonts w:hint="cs"/>
+          <w:b/>
+          <w:bCs/>
+          <w:rtl/>
+          <w:lang w:val="en-US"/>
+        </w:rPr>
+        <w:t>ה"טסטר"</w:t>
+      </w:r>
+      <w:r>
+        <w:rPr>
+          <w:rFonts w:hint="cs"/>
+          <w:b/>
+          <w:bCs/>
+          <w:rtl/>
+          <w:lang w:val="en-US"/>
+        </w:rPr>
+        <w:t xml:space="preserve"> (</w:t>
+      </w:r>
+      <w:r>
+        <w:rPr>
+          <w:b/>
+          <w:bCs/>
+        </w:rPr>
+        <w:t>TacMesh.Tests</w:t>
+      </w:r>
+      <w:r>
+        <w:rPr>
+          <w:rFonts w:hint="cs"/>
+          <w:b/>
+          <w:bCs/>
+          <w:rtl/>
+          <w:lang w:val="en-US"/>
+        </w:rPr>
+        <w:t xml:space="preserve">) </w:t>
+      </w:r>
+      <w:r>
+        <w:rPr>
+          <w:rFonts w:hint="cs"/>
+          <w:rtl/>
+          <w:lang w:val="en-US"/>
+        </w:rPr>
+        <w:t xml:space="preserve">- </w:t>
+      </w:r>
+      <w:r>
+        <w:rPr>
+          <w:rtl/>
+          <w:lang w:val="en-US"/>
+        </w:rPr>
+        <w:t>פרויקט המוקדש לבדיקות יחידה</w:t>
+      </w:r>
+      <w:r>
+        <w:rPr>
+          <w:rFonts w:hint="cs"/>
+          <w:rtl/>
+          <w:lang w:val="en-US"/>
+        </w:rPr>
+        <w:t xml:space="preserve"> </w:t>
+      </w:r>
+      <w:r>
+        <w:t>(unit testing)</w:t>
+      </w:r>
+      <w:r>
+        <w:rPr>
+          <w:rFonts w:hint="cs"/>
+          <w:rtl/>
+          <w:lang w:val="en-US"/>
+        </w:rPr>
+        <w:t xml:space="preserve"> ה</w:t>
+      </w:r>
+      <w:r>
+        <w:rPr>
+          <w:rtl/>
+          <w:lang w:val="en-US"/>
+        </w:rPr>
+        <w:t>תלוי ב</w:t>
+      </w:r>
+      <w:r>
+        <w:rPr>
+          <w:rFonts w:hint="cs"/>
+          <w:rtl/>
+        </w:rPr>
+        <w:t xml:space="preserve">ליבה </w:t>
+      </w:r>
+      <w:r>
+        <w:rPr>
+          <w:rtl/>
+          <w:lang w:val="en-US"/>
+        </w:rPr>
+        <w:t>ו</w:t>
+      </w:r>
+      <w:r>
+        <w:rPr>
+          <w:rFonts w:hint="cs"/>
+          <w:rtl/>
+          <w:lang w:val="en-US"/>
+        </w:rPr>
+        <w:t xml:space="preserve">גם </w:t>
+      </w:r>
+      <w:r>
+        <w:rPr>
+          <w:rtl/>
+          <w:lang w:val="en-US"/>
+        </w:rPr>
+        <w:t>ב</w:t>
+      </w:r>
+      <w:r>
+        <w:rPr>
+          <w:rFonts w:hint="cs"/>
+          <w:rtl/>
+        </w:rPr>
+        <w:t>סוכן</w:t>
+      </w:r>
+      <w:r>
+        <w:rPr>
+          <w:rtl/>
+          <w:lang w:val="en-US"/>
+        </w:rPr>
+        <w:t xml:space="preserve">. </w:t>
+      </w:r>
+      <w:r>
+        <w:rPr>
+          <w:rFonts w:hint="cs"/>
+          <w:rtl/>
+          <w:lang w:val="en-US"/>
+        </w:rPr>
+        <w:t>מדוע</w:t>
+      </w:r>
+      <w:r>
+        <w:rPr>
+          <w:rtl/>
+          <w:lang w:val="en-US"/>
+        </w:rPr>
+        <w:t>? מכיוון שהוא מיועד לבדיקות של דגימות קוד</w:t>
+      </w:r>
+      <w:r>
+        <w:rPr>
+          <w:rFonts w:hint="cs"/>
+          <w:rtl/>
+          <w:lang w:val="en-US"/>
+        </w:rPr>
+        <w:t>:</w:t>
+      </w:r>
+      <w:r>
+        <w:rPr>
+          <w:rtl/>
+          <w:lang w:val="en-US"/>
+        </w:rPr>
+        <w:t xml:space="preserve"> אלו יכולות להיות לוגיקה של ה</w:t>
+      </w:r>
+      <w:r>
+        <w:rPr>
+          <w:rFonts w:hint="cs"/>
+          <w:rtl/>
+        </w:rPr>
+        <w:t xml:space="preserve">ליבה </w:t>
+      </w:r>
+      <w:r>
+        <w:rPr>
+          <w:rtl/>
+          <w:lang w:val="en-US"/>
+        </w:rPr>
+        <w:t>או ניסוי של דגימות</w:t>
+      </w:r>
+      <w:r>
+        <w:rPr>
+          <w:rFonts w:hint="cs"/>
+          <w:rtl/>
+        </w:rPr>
+        <w:t xml:space="preserve"> הסוכן.</w:t>
+      </w:r>
+    </w:p>
+    <w:p>
+      <w:pPr>
+        <w:jc w:val="left"/>
+        <w:rPr>
+          <w:lang w:val="en-US"/>
+        </w:rPr>
+      </w:pPr>
+      <w:r>
+        <w:rPr>
+          <w:noProof/>
+          <w:lang/>
+        </w:rPr>
         <w:drawing>
-          <wp:anchor distT="0" distB="0" distL="114300" distR="114300" simplePos="0" relativeHeight="251658240" behindDoc="0" locked="0" layoutInCell="1" allowOverlap="1" wp14:anchorId="0F0B6066" wp14:editId="2CBD43F1">
+          <wp:anchor distT="0" distB="0" distL="114300" distR="114300" simplePos="0" relativeHeight="251658240" behindDoc="0" locked="0" layoutInCell="1" allowOverlap="1" wp14:anchorId="110E7CBB" wp14:editId="6E9E4C9B">
             <wp:simplePos x="0" y="0"/>
             <wp:positionH relativeFrom="margin">
               <wp:align>center</wp:align>
             </wp:positionH>
             <wp:positionV relativeFrom="paragraph">
-              <wp:posOffset>721360</wp:posOffset>
+              <wp:posOffset>212725</wp:posOffset>
             </wp:positionV>
-            <wp:extent cx="4091940" cy="3070860"/>
-            <wp:effectExtent l="0" t="0" r="3810" b="0"/>
+            <wp:extent cx="5867771" cy="2019300"/>
+            <wp:effectExtent l="0" t="0" r="0" b="0"/>
             <wp:wrapTopAndBottom/>
-            <wp:docPr id="397981565" name="Picture 2"/>
+            <wp:docPr id="70241089" name="Picture 1"/>
             <wp:cNvGraphicFramePr>
               <a:graphicFrameLocks xmlns:a="http://schemas.openxmlformats.org/drawingml/2006/main" noChangeAspect="1"/>
             </wp:cNvGraphicFramePr>
@@ -705,7 +889,7 @@
               <a:graphicData uri="http://schemas.openxmlformats.org/drawingml/2006/picture">
                 <pic:pic xmlns:pic="http://schemas.openxmlformats.org/drawingml/2006/picture">
                   <pic:nvPicPr>
-                    <pic:cNvPr id="0" name="Picture 6"/>
+                    <pic:cNvPr id="0" name="Picture 1"/>
                     <pic:cNvPicPr>
                       <a:picLocks noChangeAspect="1" noChangeArrowheads="1"/>
                     </pic:cNvPicPr>
@@ -726,7 +910,7 @@
                   <pic:spPr bwMode="auto">
                     <a:xfrm>
                       <a:off x="0" y="0"/>
-                      <a:ext cx="4091940" cy="3070860"/>
+                      <a:ext cx="5867771" cy="2019300"/>
                     </a:xfrm>
                     <a:prstGeom prst="rect">
                       <a:avLst/>
@@ -748,184 +932,43 @@
           </wp:anchor>
         </w:drawing>
       </w:r>
-      <w:r>
-        <w:rPr>
-          <w:rFonts w:hint="cs"/>
-          <w:b/>
-          <w:bCs/>
-          <w:rtl/>
-          <w:lang w:val="en-US"/>
-        </w:rPr>
-        <w:t>ה"טסטר"</w:t>
-      </w:r>
-      <w:r>
-        <w:rPr>
-          <w:rFonts w:hint="cs"/>
-          <w:b/>
-          <w:bCs/>
-          <w:rtl/>
-          <w:lang w:val="en-US"/>
-        </w:rPr>
-        <w:t xml:space="preserve"> (</w:t>
-      </w:r>
-      <w:r>
-        <w:rPr>
-          <w:b/>
-          <w:bCs/>
-        </w:rPr>
-        <w:t>TacMesh.Tests</w:t>
-      </w:r>
-      <w:r>
-        <w:rPr>
-          <w:rFonts w:hint="cs"/>
-          <w:b/>
-          <w:bCs/>
-          <w:rtl/>
-          <w:lang w:val="en-US"/>
-        </w:rPr>
-        <w:t xml:space="preserve">) </w:t>
-      </w:r>
-      <w:r>
-        <w:rPr>
-          <w:rFonts w:hint="cs"/>
-          <w:rtl/>
-          <w:lang w:val="en-US"/>
-        </w:rPr>
-        <w:t xml:space="preserve">- </w:t>
-      </w:r>
-      <w:r>
-        <w:rPr>
-          <w:rtl/>
-          <w:lang w:val="en-US"/>
-        </w:rPr>
-        <w:t>פרויקט המוקדש לבדיקות יחידה</w:t>
-      </w:r>
-      <w:r>
-        <w:rPr>
-          <w:rFonts w:hint="cs"/>
-          <w:rtl/>
-          <w:lang w:val="en-US"/>
-        </w:rPr>
-        <w:t xml:space="preserve"> </w:t>
-      </w:r>
-      <w:r>
-        <w:t>(unit testing)</w:t>
-      </w:r>
-      <w:r>
-        <w:rPr>
-          <w:rFonts w:hint="cs"/>
-          <w:rtl/>
-          <w:lang w:val="en-US"/>
-        </w:rPr>
-        <w:t xml:space="preserve"> ה</w:t>
-      </w:r>
-      <w:r>
-        <w:rPr>
-          <w:rtl/>
-          <w:lang w:val="en-US"/>
-        </w:rPr>
-        <w:t>תלוי ב</w:t>
-      </w:r>
-      <w:r>
-        <w:rPr>
-          <w:rFonts w:hint="cs"/>
-          <w:rtl/>
-        </w:rPr>
-        <w:t xml:space="preserve">ליבה </w:t>
-      </w:r>
-      <w:r>
-        <w:rPr>
-          <w:rtl/>
-          <w:lang w:val="en-US"/>
-        </w:rPr>
-        <w:t>ו</w:t>
-      </w:r>
-      <w:r>
-        <w:rPr>
-          <w:rFonts w:hint="cs"/>
-          <w:rtl/>
-          <w:lang w:val="en-US"/>
-        </w:rPr>
-        <w:t xml:space="preserve">גם </w:t>
-      </w:r>
-      <w:r>
-        <w:rPr>
-          <w:rtl/>
-          <w:lang w:val="en-US"/>
-        </w:rPr>
-        <w:t>ב</w:t>
-      </w:r>
-      <w:r>
-        <w:rPr>
-          <w:rFonts w:hint="cs"/>
-          <w:rtl/>
-        </w:rPr>
-        <w:t>סוכן</w:t>
-      </w:r>
-      <w:r>
-        <w:rPr>
-          <w:rtl/>
-          <w:lang w:val="en-US"/>
-        </w:rPr>
-        <w:t xml:space="preserve">. </w:t>
-      </w:r>
-      <w:r>
-        <w:rPr>
-          <w:rFonts w:hint="cs"/>
-          <w:rtl/>
-          <w:lang w:val="en-US"/>
-        </w:rPr>
-        <w:t>מדוע</w:t>
-      </w:r>
-      <w:r>
-        <w:rPr>
-          <w:rtl/>
-          <w:lang w:val="en-US"/>
-        </w:rPr>
-        <w:t>? מכיוון שהוא מיועד לבדיקות של דגימות קוד</w:t>
-      </w:r>
-      <w:r>
-        <w:rPr>
-          <w:rFonts w:hint="cs"/>
-          <w:rtl/>
-          <w:lang w:val="en-US"/>
-        </w:rPr>
-        <w:t>:</w:t>
-      </w:r>
-      <w:r>
-        <w:rPr>
-          <w:rtl/>
-          <w:lang w:val="en-US"/>
-        </w:rPr>
-        <w:t xml:space="preserve"> אלו יכולות להיות לוגיקה של ה</w:t>
-      </w:r>
-      <w:r>
-        <w:rPr>
-          <w:rFonts w:hint="cs"/>
-          <w:rtl/>
-        </w:rPr>
-        <w:t xml:space="preserve">ליבה </w:t>
-      </w:r>
-      <w:r>
-        <w:rPr>
-          <w:rtl/>
-          <w:lang w:val="en-US"/>
-        </w:rPr>
-        <w:t>או ניסוי של דגימות</w:t>
-      </w:r>
-      <w:r>
-        <w:rPr>
-          <w:rFonts w:hint="cs"/>
-          <w:rtl/>
-        </w:rPr>
-        <w:t xml:space="preserve"> הסוכן.</w:t>
-      </w:r>
-    </w:p>
-    <w:p>
-      <w:pPr>
-        <w:jc w:val="left"/>
-        <w:rPr>
-          <w:rtl/>
+    </w:p>
+    <w:p>
+      <w:pPr>
+        <w:jc w:val="left"/>
+        <w:rPr>
+          <w:lang w:val="en-US"/>
+        </w:rPr>
+      </w:pPr>
+    </w:p>
+    <w:p>
+      <w:pPr>
+        <w:jc w:val="left"/>
+        <w:rPr>
+          <w:lang w:val="en-US"/>
+        </w:rPr>
+      </w:pPr>
+    </w:p>
+    <w:p>
+      <w:pPr>
+        <w:jc w:val="left"/>
+        <w:rPr>
+          <w:lang w:val="en-US"/>
+        </w:rPr>
+      </w:pPr>
+    </w:p>
+    <w:p>
+      <w:pPr>
+        <w:jc w:val="left"/>
+        <w:rPr>
+          <w:lang w:val="en-US"/>
+        </w:rPr>
+      </w:pPr>
+    </w:p>
+    <w:p>
+      <w:pPr>
+        <w:jc w:val="left"/>
+        <w:rPr>
           <w:lang w:val="en-US"/>
         </w:rPr>
       </w:pPr>
@@ -1433,7 +1476,7 @@
           <w:rtl/>
           <w:lang w:val="en-US"/>
         </w:rPr>
-        <w:t>, הסטנדרט הוא בינארי. נתבים וסוויצ'ים לא מנתחים טקסט, הם קוראים בתים בינאריים. במיוחד כאשר בהמשך הפרויקט אני אצטרך לבנות אלגוריתמי ניתוב מציאותיים ומורכבים, חשוב להתאים את השפה.</w:t>
+        <w:t>, הסטנדרט הוא בינארי. נתבים לא מנתחים טקסט, הם קוראים בתים בינאריים. במיוחד כאשר בהמשך הפרויקט אני אצטרך לבנות אלגוריתמי ניתוב מציאותיים ומורכבים, חשוב להתאים את השפה.</w:t>
       </w:r>
     </w:p>
     <w:p>
@@ -2714,11 +2757,6 @@
           <w:numId w:val="1"/>
         </w:numPr>
         <w:jc w:val="left"/>
-        <w:rPr>
-          <w:b/>
-          <w:bCs/>
-          <w:lang w:val="en-US"/>
-        </w:rPr>
       </w:pPr>
       <w:r>
         <w:rPr>
@@ -2771,22 +2809,7 @@
           <w:rtl/>
           <w:lang w:val="en-US"/>
         </w:rPr>
-        <w:t xml:space="preserve">מנגנון אבטחתי שעולה באחד בכל הודעה שהצומת יוצר, לצורך הגנה מפני תקיפת שידור חוזר. מי קורא: כל צומת משום שצומת שומר לכל שולח, על בסיס המזהה שלו, את חלון הקבלה של 64 ערכים אחורה ואת הערך הכי גבוה שקיבל. הודעה שמונה שלה מתחת לחלון או שכבר סומנה בו נדחית. הסיבה שגם צומת מעביר קורא את השדה במקום רק צומת היעד היא מכיוון שעדיף לזרוק את </w:t>
-      </w:r>
-      <w:r>
-        <w:rPr>
-          <w:rFonts w:hint="cs"/>
-          <w:rtl/>
-          <w:lang w:val="en-US"/>
-        </w:rPr>
-        <w:t>המנה</w:t>
-      </w:r>
-      <w:r>
-        <w:rPr>
-          <w:rtl/>
-          <w:lang w:val="en-US"/>
-        </w:rPr>
-        <w:t>, אם היא זוהתה כזדונית, עוד שלב לפני שהיא הגיעה ליעד בכלל</w:t>
+        <w:t>מנגנון אבטחתי שעולה באחד בכל הודעה שהצומת יוצר, לצורך הגנה מפני תקיפת שידור חוזר. מי קורא: כל צומת משום שצומת שומר לכל שולח, על בסיס המזהה שלו, את חלון הקבלה של 64 ערכים אחורה ואת הערך הכי גבוה שקיבל. הודעה שמונה שלה מתחת לחלון או שכבר סומנה בו נדחית. הסיבה שגם צומת מעביר קורא את השדה במקום רק צומת היעד היא מכיוון שעדיף לזרוק את הפקטה, אם היא זוהתה כזדונית, עוד שלב לפני שהיא הגיעה ליעד בכלל. אם הודעה ישנה מגיעה באיחור לצומת שכבר ראה ערך גבוהה יותר מאותו שולח, נופלת בחלון ולא נשלחה בעבר, היא מתקבלת בהצלחה. אבל אם ההודעה המיושנת כבר נשלחה או שהיא לא נופלת בחלון של ה-64 ערכים אחורה, אז ההודעה נזרקת משום שזו כנראה הודעה שגורם זדוני משדר מחדש</w:t>
       </w:r>
       <w:r>
         <w:t>.</w:t>
@@ -2817,8 +2840,10 @@
       <w:pPr>
         <w:jc w:val="left"/>
         <w:rPr>
-          <w:b/>
-          <w:bCs/>
+          <w:rFonts w:hint="cs"/>
+          <w:b/>
+          <w:bCs/>
+          <w:rtl/>
           <w:lang w:val="en-US"/>
         </w:rPr>
       </w:pPr>
@@ -3134,15 +3159,7 @@
           <w:rtl/>
           <w:lang w:val="en-US"/>
         </w:rPr>
-        <w:t xml:space="preserve"> </w:t>
-      </w:r>
-      <w:r>
-        <w:rPr>
-          <w:rFonts w:hint="cs"/>
-          <w:rtl/>
-          <w:lang w:val="en-US"/>
-        </w:rPr>
-        <w:t>תחת כתובת ה-</w:t>
+        <w:t xml:space="preserve"> תחת כתובת ה-</w:t>
       </w:r>
       <w:r>
         <w:rPr>
@@ -3386,15 +3403,7 @@
           <w:rtl/>
           <w:lang w:val="en-US"/>
         </w:rPr>
-        <w:t>תהליך רקע האחראי על</w:t>
-      </w:r>
-      <w:r>
-        <w:rPr>
-          <w:rFonts w:hint="cs"/>
-          <w:rtl/>
-          <w:lang w:val="en-US"/>
-        </w:rPr>
-        <w:t xml:space="preserve"> שידור פעימת נוכחות למשתמשים בטווח שלו בקצב קבוע. בעת </w:t>
+        <w:t xml:space="preserve">תהליך רקע האחראי על שידור פעימת נוכחות למשתמשים בטווח שלו בקצב קבוע. בעת </w:t>
       </w:r>
       <w:r>
         <w:rPr>
@@ -3494,7 +3503,6 @@
       <w:pPr>
         <w:jc w:val="left"/>
         <w:rPr>
-          <w:rFonts w:hint="cs"/>
           <w:rtl/>
           <w:lang w:val="en-US"/>
         </w:rPr>
@@ -3929,7 +3937,6 @@
       <w:pPr>
         <w:jc w:val="left"/>
         <w:rPr>
-          <w:rFonts w:hint="cs"/>
           <w:rtl/>
           <w:lang w:val="en-US"/>
         </w:rPr>
@@ -4972,38 +4979,106 @@
     <w:p>
       <w:pPr>
         <w:jc w:val="left"/>
-      </w:pPr>
-      <w:r>
-        <w:rPr>
-          <w:rtl/>
-        </w:rPr>
-        <w:t>בפרויקט שלי, תהליכונים יצטרכו בסופו של דבר לבוא באינטראקציה עם שני משאבים משותפים או יותר בו-זמנית. לדוגמה: אישור הודעה שהתקבלה על ידי</w:t>
-      </w:r>
-      <w:r>
-        <w:rPr>
-          <w:rFonts w:hint="cs"/>
-          <w:rtl/>
-        </w:rPr>
-        <w:t xml:space="preserve"> רשימת השכנים </w:t>
-      </w:r>
-      <w:r>
-        <w:rPr>
-          <w:rtl/>
-        </w:rPr>
-        <w:t>ולאחר מכן שמירת ההודעה הזו בחו</w:t>
-      </w:r>
-      <w:r>
-        <w:rPr>
-          <w:rFonts w:hint="cs"/>
-          <w:rtl/>
-        </w:rPr>
-        <w:t xml:space="preserve">צץ </w:t>
-      </w:r>
-      <w:r>
-        <w:rPr>
-          <w:rtl/>
-        </w:rPr>
-        <w:t>ההודעות. אם לא היה כלל סדר להשגת המנעולים, תהליכון רקע יכול היה לנעול את הטבלה ואז לבקש את החוצץ, בעוד שתהליכון עיבוד רקע אחר עשוי לנעול את החוצץ ואז לבקש את הטבלה. אם הם ירוצו באותו רגע בדיוק הם עלולים להיתקע בקיפאון ולהמתין לנצח</w:t>
+        <w:rPr>
+          <w:rtl/>
+        </w:rPr>
+      </w:pPr>
+      <w:r>
+        <w:rPr>
+          <w:rtl/>
+        </w:rPr>
+        <w:t>בפרויקט שלי, תהליכונים</w:t>
+      </w:r>
+      <w:r>
+        <w:rPr>
+          <w:rFonts w:hint="cs"/>
+          <w:rtl/>
+        </w:rPr>
+        <w:t xml:space="preserve"> </w:t>
+      </w:r>
+      <w:r>
+        <w:rPr>
+          <w:rtl/>
+        </w:rPr>
+        <w:t>יצטרכו בסופו של דבר לגשת בו-זמנית לשני משאבים משותפים או יותר. לדוגמה, לגש</w:t>
+      </w:r>
+      <w:r>
+        <w:rPr>
+          <w:rFonts w:hint="cs"/>
+          <w:rtl/>
+        </w:rPr>
+        <w:t xml:space="preserve">ת לרשימת השכנים </w:t>
+      </w:r>
+      <w:r>
+        <w:rPr>
+          <w:rtl/>
+        </w:rPr>
+        <w:t>ולאחר מכן לגשת ל</w:t>
+      </w:r>
+      <w:r>
+        <w:rPr>
+          <w:rFonts w:hint="cs"/>
+          <w:rtl/>
+        </w:rPr>
+        <w:t xml:space="preserve">חוצץ ההודעות הממתינות </w:t>
+      </w:r>
+      <w:r>
+        <w:rPr>
+          <w:rtl/>
+        </w:rPr>
+        <w:t>כדי לשמור את ההודעה. אם לא היה כלל ברור המגדיר את סדר רכישת הנעילו</w:t>
+      </w:r>
+      <w:r>
+        <w:rPr>
+          <w:rFonts w:hint="cs"/>
+          <w:rtl/>
+        </w:rPr>
+        <w:t xml:space="preserve">ת, </w:t>
+      </w:r>
+      <w:r>
+        <w:rPr>
+          <w:rtl/>
+        </w:rPr>
+        <w:t>תהליכון רקע אחד היה יכול לנעול את הטבלה ואז לבקש גישה ל</w:t>
+      </w:r>
+      <w:r>
+        <w:rPr>
+          <w:rFonts w:hint="cs"/>
+          <w:rtl/>
+        </w:rPr>
+        <w:t xml:space="preserve">חוצץ </w:t>
+      </w:r>
+      <w:r>
+        <w:rPr>
+          <w:rtl/>
+        </w:rPr>
+        <w:t>בעוד שתהליכון עיבוד אחר ברקע היה יכול לנעול קודם את ה</w:t>
+      </w:r>
+      <w:r>
+        <w:rPr>
+          <w:rFonts w:hint="cs"/>
+          <w:rtl/>
+        </w:rPr>
+        <w:t xml:space="preserve">חוצץ </w:t>
+      </w:r>
+      <w:r>
+        <w:rPr>
+          <w:rtl/>
+        </w:rPr>
+        <w:t>ואז לבקש גישה לטבלה. אם שניהם ירוצו באותו רגע בדיוק, הם עלולים להיתקע במצב של קיפאון</w:t>
+      </w:r>
+      <w:r>
+        <w:rPr>
+          <w:rFonts w:hint="cs"/>
+          <w:rtl/>
+        </w:rPr>
+        <w:t xml:space="preserve"> </w:t>
+      </w:r>
+      <w:r>
+        <w:rPr>
+          <w:rtl/>
+        </w:rPr>
+        <w:t>ולהמתין זה לזה לנצח</w:t>
       </w:r>
       <w:r>
         <w:t>.</w:t>
@@ -5395,15 +5470,7 @@
           <w:rtl/>
           <w:lang w:val="en-US"/>
         </w:rPr>
-        <w:t xml:space="preserve">כאן בא לידי ביטוי </w:t>
-      </w:r>
-      <w:r>
-        <w:rPr>
-          <w:rFonts w:hint="cs"/>
-          <w:rtl/>
-          <w:lang w:val="en-US"/>
-        </w:rPr>
-        <w:t>מודל הרדיו הווירטואלי</w:t>
+        <w:t>כאן בא לידי ביטוי מודל הרדיו הווירטואלי</w:t>
       </w:r>
       <w:r>
         <w:rPr>
@@ -5634,15 +5701,7 @@
           <w:rtl/>
           <w:lang w:val="en-US"/>
         </w:rPr>
-        <w:t xml:space="preserve">הוא </w:t>
-      </w:r>
-      <w:r>
-        <w:rPr>
-          <w:rFonts w:hint="cs"/>
-          <w:rtl/>
-          <w:lang w:val="en-US"/>
-        </w:rPr>
-        <w:t xml:space="preserve">נועד </w:t>
+        <w:t xml:space="preserve">הוא נועד </w:t>
       </w:r>
       <w:r>
         <w:rPr>
@@ -6116,15 +6175,7 @@
           <w:rtl/>
           <w:lang w:val="en-US"/>
         </w:rPr>
-        <w:t xml:space="preserve"> ה</w:t>
-      </w:r>
-      <w:r>
-        <w:rPr>
-          <w:rFonts w:hint="cs"/>
-          <w:rtl/>
-          <w:lang w:val="en-US"/>
-        </w:rPr>
-        <w:t>פועל רק במצב הסימולציה</w:t>
+        <w:t xml:space="preserve"> הפועל רק במצב הסימולציה</w:t>
       </w:r>
       <w:r>
         <w:rPr>
@@ -6457,7 +6508,6 @@
       <w:pPr>
         <w:pStyle w:val="ListParagraph"/>
         <w:rPr>
-          <w:rFonts w:hint="cs"/>
           <w:rtl/>
           <w:lang w:val="en-US"/>
         </w:rPr>
@@ -6568,7 +6618,6 @@
       <w:pPr>
         <w:pStyle w:val="ListParagraph"/>
         <w:rPr>
-          <w:rFonts w:hint="cs"/>
           <w:rtl/>
           <w:lang w:val="en-US"/>
         </w:rPr>
@@ -6725,7 +6774,6 @@
       <w:pPr>
         <w:jc w:val="left"/>
         <w:rPr>
-          <w:rFonts w:hint="cs"/>
           <w:rtl/>
           <w:lang w:val="en-US"/>
         </w:rPr>

</xml_diff>